<commit_message>
Made changes as discussed in today's meeting.
</commit_message>
<xml_diff>
--- a/Working Folder/1 Xie Xiang Ming 谢湘铭 - A Stroll in the Lion City 狮城漫步/1 Xie Xiang Ming 谢湘铭 - A Stroll in the Lion City 狮城漫步 - Errata_v1.docx
+++ b/Working Folder/1 Xie Xiang Ming 谢湘铭 - A Stroll in the Lion City 狮城漫步/1 Xie Xiang Ming 谢湘铭 - A Stroll in the Lion City 狮城漫步 - Errata_v1.docx
@@ -317,25 +317,7 @@
           <w:color w:val="222222"/>
           <w:lang w:val="en-US" w:eastAsia="en-US"/>
         </w:rPr>
-        <w:t xml:space="preserve">, </w:t>
-      </w:r>
-      <w:proofErr w:type="spellStart"/>
-      <w:r>
-        <w:rPr>
-          <w:rFonts w:ascii="Times New Roman" w:eastAsia="Times New Roman" w:hAnsi="Times New Roman" w:cs="Times New Roman"/>
-          <w:color w:val="222222"/>
-          <w:lang w:val="en-US" w:eastAsia="en-US"/>
-        </w:rPr>
-        <w:t>Xiaotanggu</w:t>
-      </w:r>
-      <w:proofErr w:type="spellEnd"/>
-      <w:r>
-        <w:rPr>
-          <w:rFonts w:ascii="Times New Roman" w:eastAsia="Times New Roman" w:hAnsi="Times New Roman" w:cs="Times New Roman"/>
-          <w:color w:val="222222"/>
-          <w:lang w:val="en-US" w:eastAsia="en-US"/>
-        </w:rPr>
-        <w:t> </w:t>
+        <w:t>, Xiaotanggu </w:t>
       </w:r>
       <w:r>
         <w:rPr>
@@ -626,6 +608,12 @@
                 <w:rFonts w:ascii="Times" w:eastAsia="Times" w:hAnsi="Times" w:cs="Times"/>
               </w:rPr>
             </w:pPr>
+            <w:r>
+              <w:rPr>
+                <w:rFonts w:ascii="Times" w:eastAsia="Times" w:hAnsi="Times" w:cs="Times"/>
+              </w:rPr>
+              <w:t>1</w:t>
+            </w:r>
           </w:p>
         </w:tc>
         <w:tc>
@@ -639,6 +627,12 @@
                 <w:rFonts w:ascii="Times" w:eastAsia="Times" w:hAnsi="Times" w:cs="Times"/>
               </w:rPr>
             </w:pPr>
+            <w:r>
+              <w:rPr>
+                <w:rFonts w:ascii="Times" w:eastAsia="Times" w:hAnsi="Times" w:cs="Times"/>
+              </w:rPr>
+              <w:t>Timpani and Percussion</w:t>
+            </w:r>
           </w:p>
         </w:tc>
         <w:tc>
@@ -651,6 +645,12 @@
                 <w:rFonts w:ascii="Times" w:eastAsia="Times" w:hAnsi="Times" w:cs="Times"/>
               </w:rPr>
             </w:pPr>
+            <w:r>
+              <w:rPr>
+                <w:rFonts w:ascii="Times" w:eastAsia="Times" w:hAnsi="Times" w:cs="Times"/>
+              </w:rPr>
+              <w:t>Timpani was assigned Perc. 1. Change instrument listing to just Timp. All percussion player numbers moved up by 1.</w:t>
+            </w:r>
           </w:p>
         </w:tc>
         <w:tc>
@@ -684,6 +684,12 @@
                 <w:rFonts w:ascii="Times" w:eastAsia="Times" w:hAnsi="Times" w:cs="Times"/>
               </w:rPr>
             </w:pPr>
+            <w:r>
+              <w:rPr>
+                <w:rFonts w:ascii="Times" w:eastAsia="Times" w:hAnsi="Times" w:cs="Times"/>
+              </w:rPr>
+              <w:t>1</w:t>
+            </w:r>
           </w:p>
         </w:tc>
         <w:tc>
@@ -697,6 +703,12 @@
                 <w:rFonts w:ascii="Times" w:eastAsia="Times" w:hAnsi="Times" w:cs="Times"/>
               </w:rPr>
             </w:pPr>
+            <w:r>
+              <w:rPr>
+                <w:rFonts w:ascii="Times" w:eastAsia="Times" w:hAnsi="Times" w:cs="Times"/>
+              </w:rPr>
+              <w:t>Zhongruan</w:t>
+            </w:r>
           </w:p>
         </w:tc>
         <w:tc>
@@ -709,6 +721,12 @@
                 <w:rFonts w:ascii="Times" w:eastAsia="Times" w:hAnsi="Times" w:cs="Times"/>
               </w:rPr>
             </w:pPr>
+            <w:r>
+              <w:rPr>
+                <w:rFonts w:ascii="Times" w:eastAsia="Times" w:hAnsi="Times" w:cs="Times"/>
+              </w:rPr>
+              <w:t>Changed Zhongruan clef to treble instead of treble-octave-down</w:t>
+            </w:r>
           </w:p>
         </w:tc>
         <w:tc>

</xml_diff>

<commit_message>
Piece 1: Cleaned up pages 1-23
</commit_message>
<xml_diff>
--- a/Working Folder/1 Xie Xiang Ming 谢湘铭 - A Stroll in the Lion City 狮城漫步/1 Xie Xiang Ming 谢湘铭 - A Stroll in the Lion City 狮城漫步 - Errata_v1.docx
+++ b/Working Folder/1 Xie Xiang Ming 谢湘铭 - A Stroll in the Lion City 狮城漫步/1 Xie Xiang Ming 谢湘铭 - A Stroll in the Lion City 狮城漫步 - Errata_v1.docx
@@ -290,18 +290,52 @@
       <w:pPr>
         <w:shd w:val="clear" w:color="auto" w:fill="FFFFFF"/>
         <w:rPr>
+          <w:rFonts w:ascii="Times New Roman" w:eastAsiaTheme="minorEastAsia" w:hAnsi="Times New Roman" w:cs="Times New Roman"/>
+          <w:color w:val="222222"/>
+          <w:lang w:val="en-US"/>
+        </w:rPr>
+      </w:pPr>
+      <w:r>
+        <w:rPr>
           <w:rFonts w:ascii="Times New Roman" w:eastAsia="Times New Roman" w:hAnsi="Times New Roman" w:cs="Times New Roman"/>
           <w:color w:val="222222"/>
           <w:lang w:val="en-US" w:eastAsia="en-US"/>
         </w:rPr>
-      </w:pPr>
+        <w:t>2. Plucked strings, cello, double bass, Bangu </w:t>
+      </w:r>
+      <w:r>
+        <w:rPr>
+          <w:rFonts w:ascii="DengXian" w:eastAsia="DengXian" w:hAnsi="DengXian" w:cs="Times New Roman" w:hint="eastAsia"/>
+          <w:color w:val="222222"/>
+          <w:lang w:val="en-US"/>
+        </w:rPr>
+        <w:t>板鼓</w:t>
+      </w:r>
       <w:r>
         <w:rPr>
           <w:rFonts w:ascii="Times New Roman" w:eastAsia="Times New Roman" w:hAnsi="Times New Roman" w:cs="Times New Roman"/>
           <w:color w:val="222222"/>
           <w:lang w:val="en-US" w:eastAsia="en-US"/>
         </w:rPr>
-        <w:t>2. Plucked strings, cello, double bass, Bangu </w:t>
+        <w:t xml:space="preserve">, </w:t>
+      </w:r>
+      <w:proofErr w:type="spellStart"/>
+      <w:r>
+        <w:rPr>
+          <w:rFonts w:ascii="Times New Roman" w:eastAsia="Times New Roman" w:hAnsi="Times New Roman" w:cs="Times New Roman"/>
+          <w:color w:val="222222"/>
+          <w:lang w:val="en-US" w:eastAsia="en-US"/>
+        </w:rPr>
+        <w:t>Xiaotanggu</w:t>
+      </w:r>
+      <w:proofErr w:type="spellEnd"/>
+      <w:r>
+        <w:rPr>
+          <w:rFonts w:ascii="Times New Roman" w:eastAsia="Times New Roman" w:hAnsi="Times New Roman" w:cs="Times New Roman"/>
+          <w:color w:val="222222"/>
+          <w:lang w:val="en-US" w:eastAsia="en-US"/>
+        </w:rPr>
+        <w:t> </w:t>
       </w:r>
       <w:r>
         <w:rPr>
@@ -309,7 +343,7 @@
           <w:color w:val="222222"/>
           <w:lang w:val="en-US"/>
         </w:rPr>
-        <w:t>板鼓</w:t>
+        <w:t>小堂鼓</w:t>
       </w:r>
       <w:r>
         <w:rPr>
@@ -317,40 +351,19 @@
           <w:color w:val="222222"/>
           <w:lang w:val="en-US" w:eastAsia="en-US"/>
         </w:rPr>
-        <w:t>, Xiaotanggu </w:t>
+        <w:t>: Delete the notes from third last bar</w:t>
       </w:r>
       <w:r>
         <w:rPr>
-          <w:rFonts w:ascii="DengXian" w:eastAsia="DengXian" w:hAnsi="DengXian" w:cs="Times New Roman" w:hint="eastAsia"/>
+          <w:rFonts w:ascii="SimSun" w:hAnsi="SimSun" w:cs="SimSun" w:hint="eastAsia"/>
           <w:color w:val="222222"/>
           <w:lang w:val="en-US"/>
         </w:rPr>
-        <w:t>小堂鼓</w:t>
-      </w:r>
-      <w:r>
-        <w:rPr>
-          <w:rFonts w:ascii="Times New Roman" w:eastAsia="Times New Roman" w:hAnsi="Times New Roman" w:cs="Times New Roman"/>
-          <w:color w:val="222222"/>
-          <w:lang w:val="en-US" w:eastAsia="en-US"/>
-        </w:rPr>
-        <w:t>: Delete the notes from third last bar</w:t>
+        <w:t>。</w:t>
       </w:r>
     </w:p>
     <w:p>
       <w:pPr>
-        <w:ind w:left="720"/>
-        <w:jc w:val="both"/>
-        <w:rPr>
-          <w:rFonts w:ascii="Times" w:eastAsia="Times" w:hAnsi="Times" w:cs="Times"/>
-          <w:bCs/>
-          <w:sz w:val="32"/>
-          <w:szCs w:val="32"/>
-        </w:rPr>
-      </w:pPr>
-    </w:p>
-    <w:p>
-      <w:pPr>
-        <w:ind w:left="720"/>
         <w:jc w:val="both"/>
         <w:rPr>
           <w:rFonts w:ascii="SimSun" w:hAnsi="SimSun" w:cs="SimSun"/>
@@ -590,6 +603,120 @@
               </w:rPr>
               <w:t>答案</w:t>
             </w:r>
+          </w:p>
+        </w:tc>
+      </w:tr>
+      <w:tr>
+        <w:trPr>
+          <w:trHeight w:val="552"/>
+        </w:trPr>
+        <w:tc>
+          <w:tcPr>
+            <w:tcW w:w="1129" w:type="dxa"/>
+          </w:tcPr>
+          <w:p>
+            <w:pPr>
+              <w:jc w:val="center"/>
+              <w:rPr>
+                <w:rFonts w:ascii="Times" w:eastAsiaTheme="minorEastAsia" w:hAnsi="Times" w:cs="Times" w:hint="eastAsia"/>
+              </w:rPr>
+            </w:pPr>
+            <w:r>
+              <w:rPr>
+                <w:rFonts w:ascii="Times" w:eastAsiaTheme="minorEastAsia" w:hAnsi="Times" w:cs="Times" w:hint="eastAsia"/>
+              </w:rPr>
+              <w:t>Applies to whole score</w:t>
+            </w:r>
+          </w:p>
+        </w:tc>
+        <w:tc>
+          <w:tcPr>
+            <w:tcW w:w="1985" w:type="dxa"/>
+          </w:tcPr>
+          <w:p>
+            <w:pPr>
+              <w:jc w:val="center"/>
+              <w:rPr>
+                <w:rFonts w:ascii="Times" w:eastAsiaTheme="minorEastAsia" w:hAnsi="Times" w:cs="Times" w:hint="eastAsia"/>
+              </w:rPr>
+            </w:pPr>
+            <w:r>
+              <w:rPr>
+                <w:rFonts w:ascii="Times" w:eastAsiaTheme="minorEastAsia" w:hAnsi="Times" w:cs="Times" w:hint="eastAsia"/>
+              </w:rPr>
+              <w:t>P</w:t>
+            </w:r>
+            <w:r>
+              <w:rPr>
+                <w:rFonts w:ascii="Times" w:eastAsiaTheme="minorEastAsia" w:hAnsi="Times" w:cs="Times" w:hint="eastAsia"/>
+              </w:rPr>
+              <w:t>ercussion</w:t>
+            </w:r>
+          </w:p>
+        </w:tc>
+        <w:tc>
+          <w:tcPr>
+            <w:tcW w:w="3260" w:type="dxa"/>
+          </w:tcPr>
+          <w:p>
+            <w:pPr>
+              <w:rPr>
+                <w:rFonts w:ascii="Times" w:eastAsiaTheme="minorEastAsia" w:hAnsi="Times" w:cs="Times" w:hint="eastAsia"/>
+              </w:rPr>
+            </w:pPr>
+            <w:r>
+              <w:rPr>
+                <w:rFonts w:ascii="Times" w:eastAsiaTheme="minorEastAsia" w:hAnsi="Times" w:cs="Times" w:hint="eastAsia"/>
+              </w:rPr>
+              <w:t xml:space="preserve">Should </w:t>
+            </w:r>
+            <w:r>
+              <w:rPr>
+                <w:rFonts w:ascii="Times" w:eastAsiaTheme="minorEastAsia" w:hAnsi="Times" w:cs="Times"/>
+              </w:rPr>
+              <w:t>tremolo</w:t>
+            </w:r>
+            <w:r>
+              <w:rPr>
+                <w:rFonts w:ascii="Times" w:eastAsiaTheme="minorEastAsia" w:hAnsi="Times" w:cs="Times" w:hint="eastAsia"/>
+              </w:rPr>
+              <w:t xml:space="preserve"> </w:t>
+            </w:r>
+            <w:proofErr w:type="gramStart"/>
+            <w:r>
+              <w:rPr>
+                <w:rFonts w:ascii="Times" w:eastAsiaTheme="minorEastAsia" w:hAnsi="Times" w:cs="Times" w:hint="eastAsia"/>
+              </w:rPr>
+              <w:t>rolls</w:t>
+            </w:r>
+            <w:proofErr w:type="gramEnd"/>
+            <w:r>
+              <w:rPr>
+                <w:rFonts w:ascii="Times" w:eastAsiaTheme="minorEastAsia" w:hAnsi="Times" w:cs="Times" w:hint="eastAsia"/>
+              </w:rPr>
+              <w:t xml:space="preserve"> across bars be tied or not tied? </w:t>
+            </w:r>
+            <w:r>
+              <w:rPr>
+                <w:rFonts w:ascii="Times" w:eastAsiaTheme="minorEastAsia" w:hAnsi="Times" w:cs="Times" w:hint="eastAsia"/>
+              </w:rPr>
+              <w:t xml:space="preserve">Both occur at various points of the piece. </w:t>
+            </w:r>
+          </w:p>
+        </w:tc>
+        <w:tc>
+          <w:tcPr>
+            <w:tcW w:w="2711" w:type="dxa"/>
+            <w:vAlign w:val="center"/>
+          </w:tcPr>
+          <w:p>
+            <w:pPr>
+              <w:jc w:val="center"/>
+              <w:rPr>
+                <w:rFonts w:ascii="Times" w:eastAsia="Times" w:hAnsi="Times" w:cs="Times"/>
+                <w:color w:val="FF0000"/>
+              </w:rPr>
+            </w:pPr>
           </w:p>
         </w:tc>
       </w:tr>

</xml_diff>